<commit_message>
Insert fresh 2026 human-cost data (Plateau, Niger State, national SBM stats) into AVM Morgan 30-min speech Section 4
</commit_message>
<xml_diff>
--- a/avm_morgan_docs/AVM_MORGAN_COLLABORATIVE_SECURITY_STABILITY_NORTH_CENTRAL_30MIN.docx
+++ b/avm_morgan_docs/AVM_MORGAN_COLLABORATIVE_SECURITY_STABILITY_NORTH_CENTRAL_30MIN.docx
@@ -442,6 +442,18 @@
           <w:sz w:val="28"/>
         </w:rPr>
         <w:t>These are not abstract categories. In December 2023, over one hundred and forty people were killed across more than seventeen rural communities in Plateau State in a single coordinated wave of Christmas Eve attacks, and barely a month later, in January 2024, at least thirty more people were killed in further attacks around Mangu town. This was not a one-off spike: between May 2023 and May 2025, one thousand and forty-three people were killed in Benue State alone, and the single deadliest recent incident came on the night of the thirteenth and fourteenth of June 2025, when the Yelwata massacre in Guma Local Government Area of Benue State killed at least one hundred and fifty to one hundred and sixty people in one night — an incident so severe that Nigeria formally charged nine men with terrorism over it, and one that moved even Pope Leo to publicly pray for the victims at his Sunday Angelus.</w:t>
+      </w:r>
+    </w:p>
+    <w:p>
+      <w:pPr>
+        <w:spacing w:after="200"/>
+      </w:pPr>
+      <w:r>
+        <w:rPr>
+          <w:b w:val="0"/>
+          <w:sz w:val="28"/>
+        </w:rPr>
+        <w:t>This pattern has not eased in 2026. Data compiled by the Berom Youth Moulders Association and reviewed by HumAngle recorded one hundred and twenty-one people killed in Plateau State alone between May and the eleventh of July 2026 — sixty-two in May, forty-three in June, and sixteen in the first eleven days of July — across Barkin Ladi, Riyom, Bassa, Jos South and Pankshin Local Government Areas. A single weekend in July saw at least eighteen more killed across Benue and Plateau together, including an entire family murdered in Kum, in Riyom Local Government Area. Then, in August 2026, an attack around Kpenya and Dekara in the Borgu area of Niger State resulted in reports of sixty to eighty people abducted, with subsequent video evidence reportedly showing as many as six hundred women, children and elderly people held by armed men — a figure the authorities were still verifying — alongside roughly thirty killed and some two thousand residents displaced toward the Benin Republic border. Nationally, SBM Intelligence recorded seven thousand, eight hundred and twenty-five kidnapping victims between July 2025 and June 2026, with at least one thousand, one hundred and forty-two people killed, and more than seven point seven eight billion naira paid out in ransom during that period alone. This is why I insist we treat the human cost here as a development emergency, and not merely a law-and-order problem — it is lost harvests, interrupted schooling, ransom economies, and a generation growing up distrustful of the state's capacity to protect it.</w:t>
       </w:r>
     </w:p>
     <w:p>

</xml_diff>